<commit_message>
Add Gila San Francisco Consumptive Use Process document
</commit_message>
<xml_diff>
--- a/Gila San Francisco Consumptive Use Process_TL.docx
+++ b/Gila San Francisco Consumptive Use Process_TL.docx
@@ -12224,7 +12224,16 @@
         <w:t xml:space="preserve"> </w:t>
       </w:r>
       <w:r>
-        <w:t xml:space="preserve">the lower right of the Cliff Gila, Redrocks, Virden, and San Simon sheets.  To fill this out, use the district 3 watermaster’s report to find the information. </w:t>
+        <w:t xml:space="preserve">the lower right of the </w:t>
+      </w:r>
+      <w:r>
+        <w:rPr>
+          <w:color w:val="FF0000"/>
+        </w:rPr>
+        <w:t>Cliff Gila, Redrocks, Virden, and San Simon</w:t>
+      </w:r>
+      <w:r>
+        <w:t xml:space="preserve"> sheets.  To fill this out, use the district 3 watermaster’s report to find the information. </w:t>
       </w:r>
       <w:r>
         <w:t xml:space="preserve"> These are wells that are specifically irrigation wells within each area.  If they aren’t found in the watermaster’s report, reach out to District 3 to get the information. </w:t>

</xml_diff>